<commit_message>
Correct timing claim: peak 8 AM–noon, drop after 3 PM
</commit_message>
<xml_diff>
--- a/outputs/Demo_Video_Script.docx
+++ b/outputs/Demo_Video_Script.docx
@@ -145,7 +145,7 @@
           <w:rFonts w:ascii="Georgia" w:hAnsi="Georgia"/>
           <w:sz w:val="28"/>
         </w:rPr>
-        <w:t>Hi, I'm Arnav from Team Byte_me_kaar, and this is Park-Watch — our submission for Theme 1 of the Gridlock Hackathon.</w:t>
+        <w:t>Hi, I'm Arnav from Team Byte_me_kaar, and this is Park-Watch — my submission for Theme 1 of the Gridlock Hackathon.</w:t>
       </w:r>
     </w:p>
     <w:p>
@@ -190,7 +190,7 @@
           <w:rFonts w:ascii="Georgia" w:hAnsi="Georgia"/>
           <w:sz w:val="28"/>
         </w:rPr>
-        <w:t>Let me show you the most important thing we discovered.</w:t>
+        <w:t>Let me show you the most important thing I discovered.</w:t>
       </w:r>
     </w:p>
     <w:p>
@@ -202,7 +202,7 @@
           <w:rFonts w:ascii="Georgia" w:hAnsi="Georgia"/>
           <w:sz w:val="28"/>
         </w:rPr>
-        <w:t>Look at this bar chart. These are the hours when BTP books violations. From 8 AM to 3 PM — tall bars. From 4 PM to midnight — almost nothing. Across five months, only twenty-seven violations were booked at 7 PM. Twenty-seven. Across all of Bengaluru.</w:t>
+        <w:t>Look at this bar chart. These are the hours when BTP books violations. Tall bars all morning, peaking around 10 to 11 AM. After 2 PM, the chart falls off a cliff. By 3 PM it's near zero. At 7 PM, across five entire months, only twenty-seven violations were booked in all of Bengaluru. Twenty-seven.</w:t>
       </w:r>
     </w:p>
     <w:p>
@@ -214,7 +214,7 @@
           <w:rFonts w:ascii="Georgia" w:hAnsi="Georgia"/>
           <w:sz w:val="28"/>
         </w:rPr>
-        <w:t>That's not because illegal parking stops in the evening. That's because officers go home. BTP is blind for twelve hours a day, every single day.</w:t>
+        <w:t>That's not because illegal parking stops in the evening. That's because officers go home. BTP is blind for roughly twelve hours every single day.</w:t>
       </w:r>
     </w:p>
     <w:p>
@@ -247,7 +247,7 @@
           <w:rFonts w:ascii="Georgia" w:hAnsi="Georgia"/>
           <w:sz w:val="28"/>
         </w:rPr>
-        <w:t>The first question we asked is — what does this cost the city?</w:t>
+        <w:t>The first question I asked is — what does this cost the city?</w:t>
       </w:r>
     </w:p>
     <w:p>
@@ -259,7 +259,7 @@
           <w:rFonts w:ascii="Georgia" w:hAnsi="Georgia"/>
           <w:sz w:val="28"/>
         </w:rPr>
-        <w:t>For each hotspot, we pull the real road network from OpenStreetMap — lane count, speed limit, geometry. Then we apply the standard BPR delay function from transportation engineering. The result: the top one hundred parking hotspots cost Bengaluru three hundred eighty-nine crore rupees per year. That's roughly ten percent of the city's total congestion bill, coming from just one hundred zones.</w:t>
+        <w:t>For each hotspot, I pull the real road network from OpenStreetMap — lane count, speed limit, geometry. Then I apply the standard BPR delay function from transportation engineering. The result: the top one hundred parking hotspots cost Bengaluru three hundred eighty-nine crore rupees per year. That's roughly ten percent of the city's total congestion bill, coming from just one hundred zones.</w:t>
       </w:r>
     </w:p>
     <w:p>
@@ -304,7 +304,7 @@
           <w:rFonts w:ascii="Georgia" w:hAnsi="Georgia"/>
           <w:sz w:val="28"/>
         </w:rPr>
-        <w:t>Next, we built a forecasting model that predicts where violations will happen during the blind spot.</w:t>
+        <w:t>Next, I built a forecasting model that predicts where violations will happen during the blind spot.</w:t>
       </w:r>
     </w:p>
     <w:p>
@@ -340,7 +340,7 @@
           <w:rFonts w:ascii="Georgia" w:hAnsi="Georgia"/>
           <w:sz w:val="28"/>
         </w:rPr>
-        <w:t>What it tells us: across the top hundred hotspots, roughly seven hundred and twenty-two illegal-parking incidents will go unbooked in the next twenty-four hours unless we do something different.</w:t>
+        <w:t>What it tells us: across the top hundred hotspots, roughly seven hundred and twenty-two illegal-parking incidents will go unbooked in the next twenty-four hours unless something changes.</w:t>
       </w:r>
     </w:p>
     <w:p>
@@ -373,7 +373,7 @@
           <w:rFonts w:ascii="Georgia" w:hAnsi="Georgia"/>
           <w:sz w:val="28"/>
         </w:rPr>
-        <w:t>So we converted the forecast into action.</w:t>
+        <w:t>So I converted the forecast into action.</w:t>
       </w:r>
     </w:p>
     <w:p>

</xml_diff>

<commit_message>
Align script/deck/dashboard: 49 stops, R²=0.43 with train-test gap, KR Market = Upparpet
</commit_message>
<xml_diff>
--- a/outputs/Demo_Video_Script.docx
+++ b/outputs/Demo_Video_Script.docx
@@ -259,7 +259,7 @@
           <w:rFonts w:ascii="Georgia" w:hAnsi="Georgia"/>
           <w:sz w:val="28"/>
         </w:rPr>
-        <w:t>For each hotspot, I pull the real road network from OpenStreetMap — lane count, speed limit, geometry. Then I apply the standard BPR delay function from transportation engineering. The result: the top one hundred parking hotspots cost Bengaluru three hundred eighty-nine crore rupees per year. That's roughly ten percent of the city's total congestion bill, coming from just one hundred zones.</w:t>
+        <w:t>For each hotspot, I snap to the nearest road segment using OpenStreetMap and pull the real lane count. Then I apply the standard BPR delay function from transportation engineering to translate lane-blockage into vehicle-hours lost. Computed across the top one hundred hotspots, the city loses three hundred eighty-nine crore rupees a year. That's roughly ten percent of Bengaluru's total congestion bill, coming from just one hundred zones.</w:t>
       </w:r>
     </w:p>
     <w:p>
@@ -271,7 +271,7 @@
           <w:rFonts w:ascii="Georgia" w:hAnsi="Georgia"/>
           <w:sz w:val="28"/>
         </w:rPr>
-        <w:t>KR Market Junction alone — sixteen crores per month.</w:t>
+        <w:t>The single biggest one — KR Market Junction, in Upparpet — sixteen crores per month, on its own.</w:t>
       </w:r>
     </w:p>
     <w:p>
@@ -316,7 +316,7 @@
           <w:rFonts w:ascii="Georgia" w:hAnsi="Georgia"/>
           <w:sz w:val="28"/>
         </w:rPr>
-        <w:t>XGBoost regression on 1.38 million hourly observations. Eleven features — calendar, autoregressive lags, location, vehicle mix. Strict chronological train-validation-test split with early stopping.</w:t>
+        <w:t>XGBoost regression on 1.38 million hourly observations. Eleven features — calendar, autoregressive lags, location, vehicle mix. Strict chronological train, validation, test split with early stopping.</w:t>
       </w:r>
     </w:p>
     <w:p>
@@ -328,7 +328,7 @@
           <w:rFonts w:ascii="Georgia" w:hAnsi="Georgia"/>
           <w:sz w:val="28"/>
         </w:rPr>
-        <w:t>Test R-squared is 0.43. Train-to-test gap is 0.07, well below the overfit threshold. The model is small and well-regularised.</w:t>
+        <w:t>The held-out test R-squared is 0.43 — you can see it right here on the dashboard. The train-to-test gap is just zero-point-zero-seven, well below the overfit threshold. The model is small and well-regularised.</w:t>
       </w:r>
     </w:p>
     <w:p>
@@ -397,7 +397,7 @@
           <w:rFonts w:ascii="Georgia" w:hAnsi="Georgia"/>
           <w:sz w:val="28"/>
         </w:rPr>
-        <w:t>The output for tonight's evening shift: thirty-seven optimised stops, one hundred and thirteen expected catches. That's four-point-five times what BTP catches today, with the same officers and the same five-hour shift.</w:t>
+        <w:t>The output for tonight's evening shift: forty-nine optimised stops across the five patrols, one hundred and thirteen expected catches in total. That's four-point-five times what BTP catches today, with the same officers and the same five-hour shift.</w:t>
       </w:r>
     </w:p>
     <w:p>

</xml_diff>

<commit_message>
Remove non-functional filters, fix cringe phrasing in script
</commit_message>
<xml_diff>
--- a/outputs/Demo_Video_Script.docx
+++ b/outputs/Demo_Video_Script.docx
@@ -12,7 +12,7 @@
           <w:color w:val="0B2A4A"/>
           <w:sz w:val="44"/>
         </w:rPr>
-        <w:t>Park-Watch — Demo Video Script</w:t>
+        <w:t>Park-Watch — Demo Video Script (5 min)</w:t>
       </w:r>
     </w:p>
     <w:p>
@@ -125,7 +125,7 @@
           <w:color w:val="FF6B2B"/>
           <w:sz w:val="22"/>
         </w:rPr>
-        <w:t xml:space="preserve">[0:00 – 0:20]   </w:t>
+        <w:t xml:space="preserve">[0:00 – 0:30]   </w:t>
       </w:r>
       <w:r>
         <w:rPr>
@@ -133,7 +133,7 @@
           <w:color w:val="606060"/>
           <w:sz w:val="22"/>
         </w:rPr>
-        <w:t>Show top of dashboard with the title visible.</w:t>
+        <w:t>Wait 2 seconds after hitting record. Dashboard header visible.</w:t>
       </w:r>
     </w:p>
     <w:p>
@@ -145,7 +145,7 @@
           <w:rFonts w:ascii="Georgia" w:hAnsi="Georgia"/>
           <w:sz w:val="28"/>
         </w:rPr>
-        <w:t>Hi, I'm Arnav from Team Byte_me_kaar, and this is Park-Watch — my submission for Theme 1 of the Gridlock Hackathon.</w:t>
+        <w:t>Hi, I'm Arnav Jain, and this is Park-Watch — my submission for Theme One of the Gridlock Hackathon, Team Byte_me_kaar.</w:t>
       </w:r>
     </w:p>
     <w:p>
@@ -157,7 +157,7 @@
           <w:rFonts w:ascii="Georgia" w:hAnsi="Georgia"/>
           <w:sz w:val="28"/>
         </w:rPr>
-        <w:t>Bengaluru Traffic Police already collects rich data on illegal parking — almost three hundred thousand violation records in just five months. The problem isn't data. The problem is that they can't see patterns in it, and they can't act on those patterns in real time. Park-Watch fixes both.</w:t>
+        <w:t>Bengaluru Traffic Police already collects rich data on illegal parking — almost three hundred thousand violation records in just five months. The problem isn't a lack of data. The problem is that BTP can't see the patterns inside it, and they can't act on those patterns in real time. Park-Watch fixes both.</w:t>
       </w:r>
     </w:p>
     <w:p>
@@ -170,7 +170,7 @@
           <w:color w:val="FF6B2B"/>
           <w:sz w:val="22"/>
         </w:rPr>
-        <w:t xml:space="preserve">[0:20 – 0:50]   </w:t>
+        <w:t xml:space="preserve">[0:30 – 1:10]   </w:t>
       </w:r>
       <w:r>
         <w:rPr>
@@ -178,7 +178,7 @@
           <w:color w:val="606060"/>
           <w:sz w:val="22"/>
         </w:rPr>
-        <w:t>Hover over the bar chart in the 'enforcement blind spot' section.</w:t>
+        <w:t>Briefly hover over the dashboard so the BTP theme framing lands. Slow cursor.</w:t>
       </w:r>
     </w:p>
     <w:p>
@@ -190,7 +190,7 @@
           <w:rFonts w:ascii="Georgia" w:hAnsi="Georgia"/>
           <w:sz w:val="28"/>
         </w:rPr>
-        <w:t>Let me show you the most important thing I discovered.</w:t>
+        <w:t>The hackathon brief, from BTP themselves, says three things. Enforcement is patrol-based and reactive. There's no heatmap of parking violations against their congestion impact. And it's difficult to prioritize which zones deserve enforcement effort.</w:t>
       </w:r>
     </w:p>
     <w:p>
@@ -202,19 +202,7 @@
           <w:rFonts w:ascii="Georgia" w:hAnsi="Georgia"/>
           <w:sz w:val="28"/>
         </w:rPr>
-        <w:t>Look at this bar chart. These are the hours when BTP books violations. Tall bars all morning, peaking around 10 to 11 AM. After 2 PM, the chart falls off a cliff. By 3 PM it's near zero. At 7 PM, across five entire months, only twenty-seven violations were booked in all of Bengaluru. Twenty-seven.</w:t>
-      </w:r>
-    </w:p>
-    <w:p>
-      <w:pPr>
-        <w:spacing w:line="336" w:lineRule="auto" w:after="120"/>
-      </w:pPr>
-      <w:r>
-        <w:rPr>
-          <w:rFonts w:ascii="Georgia" w:hAnsi="Georgia"/>
-          <w:sz w:val="28"/>
-        </w:rPr>
-        <w:t>That's not because illegal parking stops in the evening. That's because officers go home. BTP is blind for roughly twelve hours every single day.</w:t>
+        <w:t>These are operational problems, not data problems. So I built four analytical modules on the data BTP already has — and combined them into a single dashboard an officer can use during a shift.</w:t>
       </w:r>
     </w:p>
     <w:p>
@@ -227,7 +215,7 @@
           <w:color w:val="FF6B2B"/>
           <w:sz w:val="22"/>
         </w:rPr>
-        <w:t xml:space="preserve">[0:50 – 1:25]   </w:t>
+        <w:t xml:space="preserve">[1:10 – 2:10]   </w:t>
       </w:r>
       <w:r>
         <w:rPr>
@@ -235,7 +223,7 @@
           <w:color w:val="606060"/>
           <w:sz w:val="22"/>
         </w:rPr>
-        <w:t>Scroll down to the 'Congestion cost' section.</w:t>
+        <w:t>Hover over the bar chart titled 'The 12-hour enforcement blind spot'.</w:t>
       </w:r>
     </w:p>
     <w:p>
@@ -247,7 +235,7 @@
           <w:rFonts w:ascii="Georgia" w:hAnsi="Georgia"/>
           <w:sz w:val="28"/>
         </w:rPr>
-        <w:t>The first question I asked is — what does this cost the city?</w:t>
+        <w:t>Before I explain the modules, look at this chart. These are the hours when BTP books violations. Tall bars all morning, peaking around 10 to 11 AM. After 2 PM, the chart falls off a cliff. By 3 PM, it's near zero. At 7 PM, across five entire months, only twenty-seven violations were booked in all of Bengaluru. Twenty-seven.</w:t>
       </w:r>
     </w:p>
     <w:p>
@@ -259,7 +247,7 @@
           <w:rFonts w:ascii="Georgia" w:hAnsi="Georgia"/>
           <w:sz w:val="28"/>
         </w:rPr>
-        <w:t>For each hotspot, I snap to the nearest road segment using OpenStreetMap and pull the real lane count. Then I apply the standard BPR delay function from transportation engineering to translate lane-blockage into vehicle-hours lost. Computed across the top one hundred hotspots, the city loses three hundred eighty-nine crore rupees a year. That's roughly ten percent of Bengaluru's total congestion bill, coming from just one hundred zones.</w:t>
+        <w:t>That's not because illegal parking stops. That's because officers go home. BTP is structurally blind for roughly twelve hours every single day.</w:t>
       </w:r>
     </w:p>
     <w:p>
@@ -271,7 +259,7 @@
           <w:rFonts w:ascii="Georgia" w:hAnsi="Georgia"/>
           <w:sz w:val="28"/>
         </w:rPr>
-        <w:t>The single biggest one — KR Market Junction, in Upparpet — sixteen crores per month, on its own.</w:t>
+        <w:t>This gap is the operational insight Park-Watch is built around. The rest of the system — cost quantification, forecasting, patrol routing — all exist to close it.</w:t>
       </w:r>
     </w:p>
     <w:p>
@@ -284,7 +272,7 @@
           <w:color w:val="FF6B2B"/>
           <w:sz w:val="22"/>
         </w:rPr>
-        <w:t xml:space="preserve">[1:25 – 2:05]   </w:t>
+        <w:t xml:space="preserve">[2:10 – 3:10]   </w:t>
       </w:r>
       <w:r>
         <w:rPr>
@@ -292,7 +280,76 @@
           <w:color w:val="606060"/>
           <w:sz w:val="22"/>
         </w:rPr>
-        <w:t>Scroll to the 'Blind-spot forecast' section.</w:t>
+        <w:t>Scroll down to the 'Congestion cost' section. Hover briefly over the ₹389 Cr metric.</w:t>
+      </w:r>
+    </w:p>
+    <w:p>
+      <w:pPr>
+        <w:spacing w:line="336" w:lineRule="auto" w:after="120"/>
+      </w:pPr>
+      <w:r>
+        <w:rPr>
+          <w:rFonts w:ascii="Georgia" w:hAnsi="Georgia"/>
+          <w:sz w:val="28"/>
+        </w:rPr>
+        <w:t>First question — what does this cost the city?</w:t>
+      </w:r>
+    </w:p>
+    <w:p>
+      <w:pPr>
+        <w:spacing w:line="336" w:lineRule="auto" w:after="120"/>
+      </w:pPr>
+      <w:r>
+        <w:rPr>
+          <w:rFonts w:ascii="Georgia" w:hAnsi="Georgia"/>
+          <w:sz w:val="28"/>
+        </w:rPr>
+        <w:t>For each of the three hundred eighty-one hotspots that my DBSCAN clustering identified, I snap to the nearest road segment using OpenStreetMap and pull the real lane count. Then I apply the BPR delay function — the standard equation used by every transport-planning authority in the world. When capacity drops because a lane is blocked by illegal parking, delay grows non-linearly.</w:t>
+      </w:r>
+    </w:p>
+    <w:p>
+      <w:pPr>
+        <w:spacing w:line="336" w:lineRule="auto" w:after="120"/>
+      </w:pPr>
+      <w:r>
+        <w:rPr>
+          <w:rFonts w:ascii="Georgia" w:hAnsi="Georgia"/>
+          <w:sz w:val="28"/>
+        </w:rPr>
+        <w:t>Computed across the top one hundred hotspots — which together cover over ninety percent of all violations — the city loses three hundred eighty-nine crore rupees a year. That's roughly ten percent of Bengaluru's total congestion bill, attributable to just one hundred parking zones.</w:t>
+      </w:r>
+    </w:p>
+    <w:p>
+      <w:pPr>
+        <w:spacing w:line="336" w:lineRule="auto" w:after="120"/>
+      </w:pPr>
+      <w:r>
+        <w:rPr>
+          <w:rFonts w:ascii="Georgia" w:hAnsi="Georgia"/>
+          <w:sz w:val="28"/>
+        </w:rPr>
+        <w:t>The single biggest one — KR Market Junction, in Upparpet — costs sixteen crores per month, on its own. And every assumption in this calculation — dwell time, value of time, lane capacity — is an explicit, defensible knob.</w:t>
+      </w:r>
+    </w:p>
+    <w:p>
+      <w:pPr>
+        <w:spacing w:before="280" w:after="80"/>
+      </w:pPr>
+      <w:r>
+        <w:rPr>
+          <w:b/>
+          <w:color w:val="FF6B2B"/>
+          <w:sz w:val="22"/>
+        </w:rPr>
+        <w:t xml:space="preserve">[3:10 – 4:10]   </w:t>
+      </w:r>
+      <w:r>
+        <w:rPr>
+          <w:i/>
+          <w:color w:val="606060"/>
+          <w:sz w:val="22"/>
+        </w:rPr>
+        <w:t>Scroll to 'Blind-spot forecast'. Hover over the R² metric so the train→test gap delta is visible.</w:t>
       </w:r>
     </w:p>
     <w:p>
@@ -316,7 +373,7 @@
           <w:rFonts w:ascii="Georgia" w:hAnsi="Georgia"/>
           <w:sz w:val="28"/>
         </w:rPr>
-        <w:t>XGBoost regression on 1.38 million hourly observations. Eleven features — calendar, autoregressive lags, location, vehicle mix. Strict chronological train, validation, test split with early stopping.</w:t>
+        <w:t>XGBoost regression on one-point-three-eight million hourly observations. The features cover calendar effects, recent activity lags, geographic location, and vehicle mix. A strict chronological train, validation, and test split, with early stopping at iteration fifty-nine.</w:t>
       </w:r>
     </w:p>
     <w:p>
@@ -328,7 +385,7 @@
           <w:rFonts w:ascii="Georgia" w:hAnsi="Georgia"/>
           <w:sz w:val="28"/>
         </w:rPr>
-        <w:t>The held-out test R-squared is 0.43 — you can see it right here on the dashboard. The train-to-test gap is just zero-point-zero-seven, well below the overfit threshold. The model is small and well-regularised.</w:t>
+        <w:t>The held-out test R-squared is point four three — visible right here on the dashboard. The train-to-test gap is just point zero seven, well below the overfit threshold. Importantly, the test set actually performs slightly better than validation, which tells me the model generalizes — it isn't memorizing.</w:t>
       </w:r>
     </w:p>
     <w:p>
@@ -340,7 +397,7 @@
           <w:rFonts w:ascii="Georgia" w:hAnsi="Georgia"/>
           <w:sz w:val="28"/>
         </w:rPr>
-        <w:t>What it tells us: across the top hundred hotspots, roughly seven hundred and twenty-two illegal-parking incidents will go unbooked in the next twenty-four hours unless something changes.</w:t>
+        <w:t>What does the forecast tell us? Across the top hundred hotspots, roughly seven hundred and twenty-two illegal parking incidents will go unbooked in the next twenty-four hours, unless something changes.</w:t>
       </w:r>
     </w:p>
     <w:p>
@@ -353,7 +410,7 @@
           <w:color w:val="FF6B2B"/>
           <w:sz w:val="22"/>
         </w:rPr>
-        <w:t xml:space="preserve">[2:05 – 2:40]   </w:t>
+        <w:t xml:space="preserve">[4:10 – 4:50]   </w:t>
       </w:r>
       <w:r>
         <w:rPr>
@@ -361,7 +418,7 @@
           <w:color w:val="606060"/>
           <w:sz w:val="22"/>
         </w:rPr>
-        <w:t>Scroll to the 'Tonight's optimized patrol plan' section — let the colored route map render.</w:t>
+        <w:t>Scroll to 'Tonight's optimized patrol plan'. Let the colour-coded route map render before speaking.</w:t>
       </w:r>
     </w:p>
     <w:p>
@@ -385,7 +442,7 @@
           <w:rFonts w:ascii="Georgia" w:hAnsi="Georgia"/>
           <w:sz w:val="28"/>
         </w:rPr>
-        <w:t>Weighted K-Means assigns hotspots across five patrols, balanced by expected catches. Within each patrol, nearest-neighbour TSP minimises travel time at twenty kilometres per hour with fifteen minutes of service per stop.</w:t>
+        <w:t>Weighted K-Means assigns hotspots across five patrols, balanced by expected catches. Within each patrol, nearest-neighbour TSP minimises travel time at twenty kilometres per hour, with fifteen minutes of service time per stop.</w:t>
       </w:r>
     </w:p>
     <w:p>
@@ -397,19 +454,7 @@
           <w:rFonts w:ascii="Georgia" w:hAnsi="Georgia"/>
           <w:sz w:val="28"/>
         </w:rPr>
-        <w:t>The output for tonight's evening shift: forty-nine optimised stops across the five patrols, one hundred and thirteen expected catches in total. That's four-point-five times what BTP catches today, with the same officers and the same five-hour shift.</w:t>
-      </w:r>
-    </w:p>
-    <w:p>
-      <w:pPr>
-        <w:spacing w:line="336" w:lineRule="auto" w:after="120"/>
-      </w:pPr>
-      <w:r>
-        <w:rPr>
-          <w:rFonts w:ascii="Georgia" w:hAnsi="Georgia"/>
-          <w:sz w:val="28"/>
-        </w:rPr>
-        <w:t>No new sensors. No new cameras. Just a smarter route.</w:t>
+        <w:t>The output for tonight's evening shift — forty-nine optimised stops across the five patrols, one hundred and thirteen expected catches in total. That's four-point-five times what BTP catches today, with the same officers and the same five-hour shift.</w:t>
       </w:r>
     </w:p>
     <w:p>
@@ -422,7 +467,7 @@
           <w:color w:val="FF6B2B"/>
           <w:sz w:val="22"/>
         </w:rPr>
-        <w:t xml:space="preserve">[2:40 – 3:00]   </w:t>
+        <w:t xml:space="preserve">[4:50 – 5:00]   </w:t>
       </w:r>
       <w:r>
         <w:rPr>
@@ -430,7 +475,7 @@
           <w:color w:val="606060"/>
           <w:sz w:val="22"/>
         </w:rPr>
-        <w:t>Slow-scroll back up to the top of the dashboard.</w:t>
+        <w:t>Slow-scroll back up to the top of the dashboard. Steady cursor.</w:t>
       </w:r>
     </w:p>
     <w:p>
@@ -442,19 +487,7 @@
           <w:rFonts w:ascii="Georgia" w:hAnsi="Georgia"/>
           <w:sz w:val="28"/>
         </w:rPr>
-        <w:t>Park-Watch is the intelligence layer that closes BTP's twelve-hour enforcement coverage gap.</w:t>
-      </w:r>
-    </w:p>
-    <w:p>
-      <w:pPr>
-        <w:spacing w:line="336" w:lineRule="auto" w:after="120"/>
-      </w:pPr>
-      <w:r>
-        <w:rPr>
-          <w:rFonts w:ascii="Georgia" w:hAnsi="Georgia"/>
-          <w:sz w:val="28"/>
-        </w:rPr>
-        <w:t>It runs on the data BTP already has. It costs nothing extra to deploy. And every officer keeps doing what they already do — just smarter.</w:t>
+        <w:t>Park-Watch is the intelligence layer that closes Bengaluru's twelve-hour enforcement blind spot. It runs on the data BTP already collects. No new sensors. No new cameras. And every officer keeps doing what they already do — just smarter.</w:t>
       </w:r>
     </w:p>
     <w:p>

</xml_diff>

<commit_message>
Add honest limitation note: dataset is bookings not all events
</commit_message>
<xml_diff>
--- a/outputs/Demo_Video_Script.docx
+++ b/outputs/Demo_Video_Script.docx
@@ -402,6 +402,18 @@
     </w:p>
     <w:p>
       <w:pPr>
+        <w:spacing w:line="336" w:lineRule="auto" w:after="120"/>
+      </w:pPr>
+      <w:r>
+        <w:rPr>
+          <w:rFonts w:ascii="Georgia" w:hAnsi="Georgia"/>
+          <w:sz w:val="28"/>
+        </w:rPr>
+        <w:t>One honest caveat: the dataset captures booked violations, not every illegal parking event. So the model predicts violation density extrapolated from observed booking patterns — it's a testable hypothesis a one-week BTP pilot could validate.</w:t>
+      </w:r>
+    </w:p>
+    <w:p>
+      <w:pPr>
         <w:spacing w:before="280" w:after="80"/>
       </w:pPr>
       <w:r>

</xml_diff>

<commit_message>
Add honest caveats: patrol count is parameter, dataset is bookings
</commit_message>
<xml_diff>
--- a/outputs/Demo_Video_Script.docx
+++ b/outputs/Demo_Video_Script.docx
@@ -466,6 +466,18 @@
           <w:rFonts w:ascii="Georgia" w:hAnsi="Georgia"/>
           <w:sz w:val="28"/>
         </w:rPr>
+        <w:t>Note — five patrols is a demo scenario. The optimizer is parameterized, so in deployment, BTP would provide their actual nightly fleet size and the routes scale to match.</w:t>
+      </w:r>
+    </w:p>
+    <w:p>
+      <w:pPr>
+        <w:spacing w:line="336" w:lineRule="auto" w:after="120"/>
+      </w:pPr>
+      <w:r>
+        <w:rPr>
+          <w:rFonts w:ascii="Georgia" w:hAnsi="Georgia"/>
+          <w:sz w:val="28"/>
+        </w:rPr>
         <w:t>The output for tonight's evening shift — forty-nine optimised stops across the five patrols, one hundred and thirteen expected catches in total. That's four-point-five times what BTP catches today, with the same officers and the same five-hour shift.</w:t>
       </w:r>
     </w:p>

</xml_diff>